<commit_message>
journal v7_ko: reframe jurisdiction interpretation as arena of competition/protection; applicant data demoted to complementary
Co-Authored-By: Claude Fable 5.1 <noreply@anthropic.com>
Claude-Session: https://claude.ai/code/session_01SvckvZxt3hAXTDPnm8YPEC
</commit_message>
<xml_diff>
--- a/journal/manuscript_v7_ko.docx
+++ b/journal/manuscript_v7_ko.docx
@@ -5974,7 +5974,39 @@
         <w:t xml:space="preserve"> </w:t>
       </w:r>
       <w:r>
-        <w:t xml:space="preserve">네 번째 함의는 특허 수준 결과를 전략 문헌과 연결하되, 관할권 변수가 출원청이지 출원인 국적이 아니라는 제4.2절의 단서 안에서 읽어야 한다. 관할권 대비는 공정 단독형 방정식에 집중되어 있으며 제2.4절에서 제시한 해석과 부합한다. 중국 출원청 출원은 범위가 좁고 공정 단독형에 편중되어 있다. 이는 통합된 적층 전체를 청구하기 전에 특정 제조 단계를 내재화하는 추격 자세의 프로필과 부합하며(Lee and Lim, 2001), 중국 특허의 양적 팽창이 보조금과 추격 동학에 의해 형성되어 왔다는 증거(Hu and Jefferson, 2009; Dang and Motohashi, 2015)와도 일관된다. 다만 이는 결과와 부합하는 한 가지 해석이다. 중국 출원청에는 외국 기업이 중국 시장 보호를 위해 제출한 2차 출원이 다수 포함되며, 이러한 패밀리 구성원 출원은 통상 원출원보다 범위가 좁게 정리되므로, 좁고 공정 단독형인 프로필의 일부는 외국 출원인의 방어적 출원 관행과 중국 심사 관행에서 비롯되었을 수 있다. 두 해석을 가르려면 출원인 국적 또는 우선권 출원청 기준의 재추정이 필요하다(제6.3절).</w:t>
+        <w:t xml:space="preserve">네 번째 함의는 특허 수준 결과를 전략 문헌과 연결하되, 관할권 변수가 출원청이지 출원인 국적이 아니라는 제4.2절의 단서 안에서 읽어야 한다. 관할권 대비는 공정 단독형 방정식에 집중되어 있으며 제2.4절에서 제시한 해석과 부합한다. 중국 출원청 출원은 범위가 좁고 공정 단독형에 편중되어 있다. 이는 통합된 적층 전체를 청구하기 전에 특정 제조 단계를 내재화하는 추격 자세의 프로필과 부합하며(Lee and Lim, 2001), 중국 특허의 양적 팽창이 보조금과 추격 동학에 의해 형성되어 왔다는 증거(Hu and Jefferson, 2009; Dang and Motohashi, 2015)와도 일관된다. 여기서 관할권 변수의 의미를 정확히 해 둘 필요가 있다. 출원청은 출원인의 국적이 아니라</w:t>
+      </w:r>
+      <w:r>
+        <w:t xml:space="preserve"> </w:t>
+      </w:r>
+      <w:r>
+        <w:rPr>
+          <w:i/>
+          <w:iCs/>
+        </w:rPr>
+        <w:t xml:space="preserve">어느 시장에서 무엇을 보호할 가치가 있다고 판단되었는가</w:t>
+      </w:r>
+      <w:r>
+        <w:t xml:space="preserve"> </w:t>
+      </w:r>
+      <w:r>
+        <w:t xml:space="preserve">를 드러낸다. 중국 출원청에는 중국 기업의 출원뿐 아니라 외국 기업이 중국 시장을 겨냥해 선택적으로 제출한 출원도 포함되는데, 어느 쪽이든 출원인은 자신의 특허 패밀리 가운데 그 관할권에서 보호가 필요한 발명을 골라 낸다. 따라서 중국 출원청 출원이 좁고 공정 단독형에 편중되어 있다는 결과는, 출원인이 누구인가와 무관하게</w:t>
+      </w:r>
+      <w:r>
+        <w:t xml:space="preserve"> </w:t>
+      </w:r>
+      <w:r>
+        <w:rPr>
+          <w:b/>
+          <w:bCs/>
+        </w:rPr>
+        <w:t xml:space="preserve">중국 관할권이 전공정 공정 기술을 둘러싼 경쟁과 보호의 장</w:t>
+      </w:r>
+      <w:r>
+        <w:t xml:space="preserve"> </w:t>
+      </w:r>
+      <w:r>
+        <w:t xml:space="preserve">이라는 사실을 보여준다. 중국 기업이 특정 제조 단계를 내재화하려 출원하는 경우와 외국 기업이 그 단계를 선점하려 출원하는 경우는 주체는 다르지만 같은 관할권 프로필을 만들며, 둘 다 추격 동학의 양면이다. 출원인 국적 자료가 있다면 두 주체의 상대적 기여를 나눌 수 있겠지만, 관할권 수준의 결론 자체는 그 구분에 의존하지 않는다.</w:t>
       </w:r>
     </w:p>
     <w:p>
@@ -6048,7 +6080,7 @@
         <w:pStyle w:val="BodyText"/>
       </w:pPr>
       <w:r>
-        <w:t xml:space="preserve">정책에 대해서는 관할권 대비가 시사적이다. 중국 출원청 프로필은, 추격 해석을 취할 경우, 단계별로 진행되는 추격 전략과 부합한다. 이러한 전략은 제조 역량의 내재화에는 효과적이지만 통합형 청구를 타국 출원인에게 남겨 둔다. 특허 건수를 보상하는 산업정책(Dang and Motohashi, 2015)은 이 패턴을 강화할 것이다. 한국 출원청 계수는 어느 모형에서도 유의하지 않으므로, 한국에 대한 함의는 한국 고유의 효과가 아니라 표본 전체의 패턴에서 추론한 것이다. 메모리 제조사가 차세대 HBM을 위해 하이브리드 본딩에 의존하는 한국에 대해 결과는, 패키징 경쟁력이 패키징 노하우만이 아니라 평탄화, 표면 화학, 정렬 계측 등 전공정 역량과 이를 통합형 청구로 결합하는 능력에 의해 결정될 것임을 함의한다.</w:t>
+        <w:t xml:space="preserve">정책에 대해서는 관할권 대비가 시사적이다. 중국 관할권의 프로필은 전공정 공정 단계를 둘러싼 경쟁이 그곳에 집중되어 있음을 보여주며, 이는 단계별로 진행되는 추격 동학과 부합한다. 이러한 경쟁은 제조 역량의 내재화에는 효과적이지만, 두 단계를 결합한 통합형 청구는 상대적으로 다른 관할권에서 이루어지고 있다. 특허 건수를 보상하는 산업정책(Dang and Motohashi, 2015)은 이 패턴을 강화할 것이다. 한국 출원청 계수는 어느 모형에서도 유의하지 않으므로, 한국에 대한 함의는 한국 고유의 효과가 아니라 표본 전체의 패턴에서 추론한 것이다. 메모리 제조사가 차세대 HBM을 위해 하이브리드 본딩에 의존하는 한국에 대해 결과는, 패키징 경쟁력이 패키징 노하우만이 아니라 평탄화, 표면 화학, 정렬 계측 등 전공정 역량과 이를 통합형 청구로 결합하는 능력에 의해 결정될 것임을 함의한다.</w:t>
       </w:r>
     </w:p>
     <w:bookmarkEnd w:id="43"/>
@@ -6066,7 +6098,7 @@
         <w:pStyle w:val="FirstParagraph"/>
       </w:pPr>
       <w:r>
-        <w:t xml:space="preserve">본 연구는 네 가지 한계를 갖는다. 첫째, 관할권 변수는 출원청이지 출원인의 국적이 아니다. 출원청 간 차이는 발명의 기원과 보호 전략을 섞는다. 출원을 출원인 식별자와 본사 위치에 연결하면 둘을 분리하고 기업 고정효과와 출원인 유형 통제를 넣을 수 있으며, 이는 특히 일본 출원청의 취약한 결과와 중국 출원청에 대한 두 해석(추격 대 방어 출원)을 가르는 데 필요하다. 둘째, 추정치는 연관적이다. 범위와 전략은 공동 결정될 개연성이 있고, 데이터에 신뢰할 만한 도구변수가 없어 인과 식별을 시도하지 않는다. 기술범위와 통합형 사이의 연관에 있는 구성상의 요소는 조정 범위로 분리하였으나(제5.4절), 기술범위 자체가 H01L21·H01L24 두 클래스 내부에서만 측정된다는 한계는 남는다. 추출 단계에서 다른 클래스의 기호가 보존되지 않았으므로, 반도체 외부 분야로의 확장을 포함하는 본래 의미의 기술범위(Lerner, 1994)는 전체 CPC 기호를 확보하여 재구성해야 한다. 셋째, 융합 신호는 CPC 공동분류로, 결정론적이고 재현 가능하지만 발명에 뒤처진다. 텍스트 기반 방법(Preschitschek et al., 2013; Zhu and Motohashi, 2022)은 심사관이 전공정 코드를 부여하기 전에 경계 넘기를 탐지할 수 있으나 학습된 모형에 의존한다는 비용이 따른다. H01L21과 H01L24의 경계가 제도적으로 명확한 본 연구의 설정에서는 재현가능성이 더 큰 미덕이라고 판단하였다. 경계가 덜 코드화된 설정에서는 이 상충관계가 반대로 작동할 수 있다. 넷째, 각 출원이 CPC 기호의 집합이라는 점에서 특허의 공동분류 구조는 다대다이며, 본 연구의 이항·삼분 부호화는 그 구조를 단일 경계로 투영한다. 고차 공출현을 보존하는 하이퍼그래프 표현과 Trajtenberg et al.(1997) 및 Petralia(2020) 전통의 일반성(generality) 지수는 하이브리드 본딩이 로직·메모리·이미지센서·전력소자로 확산되는 데서 시사되는 범용기술적 성격을 직접 검정할 수 있게 할 것이다(Bresnahan and Trajtenberg, 1995; Hall and Trajtenberg, 2004 참조).</w:t>
+        <w:t xml:space="preserve">본 연구는 네 가지 한계를 갖는다. 첫째, 관할권 변수는 출원청이므로 본 연구의 결론은 각 관할권에서 무엇이 보호되는가에 관한 것이며, 어느 국적의 기업이 그렇게 하는가에 관한 것은 아니다. 관할권 수준의 결론은 이 구분에 의존하지 않지만, 출원인 식별자와 본사 위치를 연결하면 기업 고정효과와 출원인 유형 통제를 넣어 추정을 정밀하게 하고, 특히 표본이 작은 일본 출원청 결과의 취약성이 출원인 구성의 변화에서 비롯되는지를 확인할 수 있을 것이다. 둘째, 추정치는 연관적이다. 범위와 전략은 공동 결정될 개연성이 있고, 데이터에 신뢰할 만한 도구변수가 없어 인과 식별을 시도하지 않는다. 기술범위와 통합형 사이의 연관에 있는 구성상의 요소는 조정 범위로 분리하였으나(제5.4절), 기술범위 자체가 H01L21·H01L24 두 클래스 내부에서만 측정된다는 한계는 남는다. 추출 단계에서 다른 클래스의 기호가 보존되지 않았으므로, 반도체 외부 분야로의 확장을 포함하는 본래 의미의 기술범위(Lerner, 1994)는 전체 CPC 기호를 확보하여 재구성해야 한다. 셋째, 융합 신호는 CPC 공동분류로, 결정론적이고 재현 가능하지만 발명에 뒤처진다. 텍스트 기반 방법(Preschitschek et al., 2013; Zhu and Motohashi, 2022)은 심사관이 전공정 코드를 부여하기 전에 경계 넘기를 탐지할 수 있으나 학습된 모형에 의존한다는 비용이 따른다. H01L21과 H01L24의 경계가 제도적으로 명확한 본 연구의 설정에서는 재현가능성이 더 큰 미덕이라고 판단하였다. 경계가 덜 코드화된 설정에서는 이 상충관계가 반대로 작동할 수 있다. 넷째, 각 출원이 CPC 기호의 집합이라는 점에서 특허의 공동분류 구조는 다대다이며, 본 연구의 이항·삼분 부호화는 그 구조를 단일 경계로 투영한다. 고차 공출현을 보존하는 하이퍼그래프 표현과 Trajtenberg et al.(1997) 및 Petralia(2020) 전통의 일반성(generality) 지수는 하이브리드 본딩이 로직·메모리·이미지센서·전력소자로 확산되는 데서 시사되는 범용기술적 성격을 직접 검정할 수 있게 할 것이다(Bresnahan and Trajtenberg, 1995; Hall and Trajtenberg, 2004 참조).</w:t>
       </w:r>
     </w:p>
     <w:p>

</xml_diff>

<commit_message>
journal v7_ko: tone down applicant-data mentions to a light touch
Co-Authored-By: Claude Fable 5.1 <noreply@anthropic.com>
Claude-Session: https://claude.ai/code/session_01SvckvZxt3hAXTDPnm8YPEC
</commit_message>
<xml_diff>
--- a/journal/manuscript_v7_ko.docx
+++ b/journal/manuscript_v7_ko.docx
@@ -2068,12 +2068,6 @@
         <w:pStyle w:val="BodyText"/>
       </w:pPr>
       <w:r>
-        <w:t xml:space="preserve">관할권 관련 결과의 해석에는 한 가지 단서가 필요하다.</w:t>
-      </w:r>
-      <w:r>
-        <w:t xml:space="preserve"> </w:t>
-      </w:r>
-      <w:r>
         <w:rPr>
           <w:i/>
           <w:iCs/>
@@ -2084,7 +2078,7 @@
         <w:t xml:space="preserve"> </w:t>
       </w:r>
       <w:r>
-        <w:t xml:space="preserve">는 출원이 제출된 출원청이지 출원인의 국적이 아니며, WO와 EP는 국가가 아니라 국제·지역 출원 경로다. 따라서 출원청 간 차이는 발명의 기원뿐 아니라 출원·보호 전략을 반영하며, 본 연구는 이를 일관되게 그러한 관점에서 해석한다.</w:t>
+        <w:t xml:space="preserve">는 출원이 제출된 출원청이며, WO와 EP는 국제·지역 출원 경로다. 따라서 출원청 간 차이는 각 관할권에서 무엇이 보호할 가치가 있다고 판단되었는가, 즉 출원·보호 전략의 차이로 해석한다.</w:t>
       </w:r>
     </w:p>
     <w:bookmarkEnd w:id="22"/>
@@ -5974,7 +5968,7 @@
         <w:t xml:space="preserve"> </w:t>
       </w:r>
       <w:r>
-        <w:t xml:space="preserve">네 번째 함의는 특허 수준 결과를 전략 문헌과 연결하되, 관할권 변수가 출원청이지 출원인 국적이 아니라는 제4.2절의 단서 안에서 읽어야 한다. 관할권 대비는 공정 단독형 방정식에 집중되어 있으며 제2.4절에서 제시한 해석과 부합한다. 중국 출원청 출원은 범위가 좁고 공정 단독형에 편중되어 있다. 이는 통합된 적층 전체를 청구하기 전에 특정 제조 단계를 내재화하는 추격 자세의 프로필과 부합하며(Lee and Lim, 2001), 중국 특허의 양적 팽창이 보조금과 추격 동학에 의해 형성되어 왔다는 증거(Hu and Jefferson, 2009; Dang and Motohashi, 2015)와도 일관된다. 여기서 관할권 변수의 의미를 정확히 해 둘 필요가 있다. 출원청은 출원인의 국적이 아니라</w:t>
+        <w:t xml:space="preserve">네 번째 함의는 특허 수준 결과를 전략 문헌과 연결한다. 관할권 대비는 공정 단독형 방정식에 집중되어 있으며 제2.4절에서 제시한 해석과 부합한다. 중국 출원청 출원은 범위가 좁고 공정 단독형에 편중되어 있다. 이는 통합된 적층 전체를 청구하기 전에 특정 제조 단계를 내재화하는 추격 자세의 프로필과 부합하며(Lee and Lim, 2001), 중국 특허의 양적 팽창이 보조금과 추격 동학에 의해 형성되어 왔다는 증거(Hu and Jefferson, 2009; Dang and Motohashi, 2015)와도 일관된다. 출원청은</w:t>
       </w:r>
       <w:r>
         <w:t xml:space="preserve"> </w:t>
@@ -5990,7 +5984,7 @@
         <w:t xml:space="preserve"> </w:t>
       </w:r>
       <w:r>
-        <w:t xml:space="preserve">를 드러낸다. 중국 출원청에는 중국 기업의 출원뿐 아니라 외국 기업이 중국 시장을 겨냥해 선택적으로 제출한 출원도 포함되는데, 어느 쪽이든 출원인은 자신의 특허 패밀리 가운데 그 관할권에서 보호가 필요한 발명을 골라 낸다. 따라서 중국 출원청 출원이 좁고 공정 단독형에 편중되어 있다는 결과는, 출원인이 누구인가와 무관하게</w:t>
+        <w:t xml:space="preserve">를 드러내는 변수다. 출원인은 자신의 특허 패밀리 가운데 각 관할권에서 보호가 필요한 발명을 골라 출원하므로, 중국 출원청 출원이 좁고 공정 단독형에 편중되어 있다는 결과는</w:t>
       </w:r>
       <w:r>
         <w:t xml:space="preserve"> </w:t>
@@ -6006,7 +6000,7 @@
         <w:t xml:space="preserve"> </w:t>
       </w:r>
       <w:r>
-        <w:t xml:space="preserve">이라는 사실을 보여준다. 중국 기업이 특정 제조 단계를 내재화하려 출원하는 경우와 외국 기업이 그 단계를 선점하려 출원하는 경우는 주체는 다르지만 같은 관할권 프로필을 만들며, 둘 다 추격 동학의 양면이다. 출원인 국적 자료가 있다면 두 주체의 상대적 기여를 나눌 수 있겠지만, 관할권 수준의 결론 자체는 그 구분에 의존하지 않는다.</w:t>
+        <w:t xml:space="preserve">이라는 사실을 보여준다. 특정 제조 단계를 내재화하려는 출원과 그 단계를 선점하려는 출원은 같은 관할권 프로필을 만들며, 둘 다 추격 동학의 양면이다.</w:t>
       </w:r>
     </w:p>
     <w:p>
@@ -6098,7 +6092,7 @@
         <w:pStyle w:val="FirstParagraph"/>
       </w:pPr>
       <w:r>
-        <w:t xml:space="preserve">본 연구는 네 가지 한계를 갖는다. 첫째, 관할권 변수는 출원청이므로 본 연구의 결론은 각 관할권에서 무엇이 보호되는가에 관한 것이며, 어느 국적의 기업이 그렇게 하는가에 관한 것은 아니다. 관할권 수준의 결론은 이 구분에 의존하지 않지만, 출원인 식별자와 본사 위치를 연결하면 기업 고정효과와 출원인 유형 통제를 넣어 추정을 정밀하게 하고, 특히 표본이 작은 일본 출원청 결과의 취약성이 출원인 구성의 변화에서 비롯되는지를 확인할 수 있을 것이다. 둘째, 추정치는 연관적이다. 범위와 전략은 공동 결정될 개연성이 있고, 데이터에 신뢰할 만한 도구변수가 없어 인과 식별을 시도하지 않는다. 기술범위와 통합형 사이의 연관에 있는 구성상의 요소는 조정 범위로 분리하였으나(제5.4절), 기술범위 자체가 H01L21·H01L24 두 클래스 내부에서만 측정된다는 한계는 남는다. 추출 단계에서 다른 클래스의 기호가 보존되지 않았으므로, 반도체 외부 분야로의 확장을 포함하는 본래 의미의 기술범위(Lerner, 1994)는 전체 CPC 기호를 확보하여 재구성해야 한다. 셋째, 융합 신호는 CPC 공동분류로, 결정론적이고 재현 가능하지만 발명에 뒤처진다. 텍스트 기반 방법(Preschitschek et al., 2013; Zhu and Motohashi, 2022)은 심사관이 전공정 코드를 부여하기 전에 경계 넘기를 탐지할 수 있으나 학습된 모형에 의존한다는 비용이 따른다. H01L21과 H01L24의 경계가 제도적으로 명확한 본 연구의 설정에서는 재현가능성이 더 큰 미덕이라고 판단하였다. 경계가 덜 코드화된 설정에서는 이 상충관계가 반대로 작동할 수 있다. 넷째, 각 출원이 CPC 기호의 집합이라는 점에서 특허의 공동분류 구조는 다대다이며, 본 연구의 이항·삼분 부호화는 그 구조를 단일 경계로 투영한다. 고차 공출현을 보존하는 하이퍼그래프 표현과 Trajtenberg et al.(1997) 및 Petralia(2020) 전통의 일반성(generality) 지수는 하이브리드 본딩이 로직·메모리·이미지센서·전력소자로 확산되는 데서 시사되는 범용기술적 성격을 직접 검정할 수 있게 할 것이다(Bresnahan and Trajtenberg, 1995; Hall and Trajtenberg, 2004 참조).</w:t>
+        <w:t xml:space="preserve">본 연구는 네 가지 한계를 갖는다. 첫째, 본 연구의 관할권 단위는 출원청이므로 결론은 각 관할권에서 무엇이 보호되는가에 관한 것이다. 출원인 수준의 정보를 결합하면 기업 고정효과 등으로 추정을 더 정밀하게 할 수 있다. 둘째, 추정치는 연관적이다. 범위와 전략은 공동 결정될 개연성이 있고, 데이터에 신뢰할 만한 도구변수가 없어 인과 식별을 시도하지 않는다. 기술범위와 통합형 사이의 연관에 있는 구성상의 요소는 조정 범위로 분리하였으나(제5.4절), 기술범위 자체가 H01L21·H01L24 두 클래스 내부에서만 측정된다는 한계는 남는다. 추출 단계에서 다른 클래스의 기호가 보존되지 않았으므로, 반도체 외부 분야로의 확장을 포함하는 본래 의미의 기술범위(Lerner, 1994)는 전체 CPC 기호를 확보하여 재구성해야 한다. 셋째, 융합 신호는 CPC 공동분류로, 결정론적이고 재현 가능하지만 발명에 뒤처진다. 텍스트 기반 방법(Preschitschek et al., 2013; Zhu and Motohashi, 2022)은 심사관이 전공정 코드를 부여하기 전에 경계 넘기를 탐지할 수 있으나 학습된 모형에 의존한다는 비용이 따른다. H01L21과 H01L24의 경계가 제도적으로 명확한 본 연구의 설정에서는 재현가능성이 더 큰 미덕이라고 판단하였다. 경계가 덜 코드화된 설정에서는 이 상충관계가 반대로 작동할 수 있다. 넷째, 각 출원이 CPC 기호의 집합이라는 점에서 특허의 공동분류 구조는 다대다이며, 본 연구의 이항·삼분 부호화는 그 구조를 단일 경계로 투영한다. 고차 공출현을 보존하는 하이퍼그래프 표현과 Trajtenberg et al.(1997) 및 Petralia(2020) 전통의 일반성(generality) 지수는 하이브리드 본딩이 로직·메모리·이미지센서·전력소자로 확산되는 데서 시사되는 범용기술적 성격을 직접 검정할 수 있게 할 것이다(Bresnahan and Trajtenberg, 1995; Hall and Trajtenberg, 2004 참조).</w:t>
       </w:r>
     </w:p>
     <w:p>

</xml_diff>

<commit_message>
journal v7_ko: soften novelty claim ('드물다'), cite Karvonen & Kässi 2012 as closest prior work
Co-Authored-By: Claude Fable 5.1 <noreply@anthropic.com>
Claude-Session: https://claude.ai/code/session_01SvckvZxt3hAXTDPnm8YPEC
</commit_message>
<xml_diff>
--- a/journal/manuscript_v7_ko.docx
+++ b/journal/manuscript_v7_ko.docx
@@ -327,7 +327,7 @@
         <w:t xml:space="preserve"> </w:t>
       </w:r>
       <w:r>
-        <w:t xml:space="preserve">에서 그 산업의 가치사슬 단계를 가로지르는 융합은 같은 분석 도구로 검토된 바 없다. 그러나 누가 무엇을 하고 누가 가치를 획득하는가라는 산업 아키텍처를 재편하는 것은 바로 이러한 종류의 융합이다(Jacobides et al., 2006).</w:t>
+        <w:t xml:space="preserve">에서 가치사슬 단계를 가로지르는 융합은 드물게만 다루어졌다. 가치사슬 상·하류 기업 간의 기술 인터페이스를 특허 인용으로 분석한 Karvonen과 Kässi(2012)의 RFID 연구가 가장 가까운 선례이지만, 이는 기업 간 지식 흐름을 다루었을 뿐 하나의 공정기술이 제조 단계의 경계를 넘는지를 개별 특허 수준에서 검정하지는 않았다. 그러나 누가 무엇을 하고 누가 가치를 획득하는가라는 산업 아키텍처를 재편하는 것은 바로 이러한 종류의 융합이다(Jacobides et al., 2006).</w:t>
       </w:r>
     </w:p>
     <w:p>
@@ -677,7 +677,7 @@
         <w:t xml:space="preserve"> </w:t>
       </w:r>
       <w:r>
-        <w:t xml:space="preserve">에 의존한다는 점을 인식할 때 분명해진다. Ernst(2005)는 칩 설계의 수직 전문화가 의존하는 모듈성이 복잡성이 커지면서 한계를 갖는다는 것을 보였다. Jacobides et al.(2006)은 누가 무엇을 하고 가치가 어떻게 배분되는지를 정의하는 템플릿인 산업 아키텍처가 그 자체로 경쟁의 대상이며, 단계 간 상호의존을 바꾸는 혁신은 그 재협상을 불러온다고 주장하였다. 하이브리드 본딩이 바로 그러한 혁신이다. 수율이 웨이퍼 수준 평탄화, 표면 화학, 정렬 등 전공정에 자리한 역량에 달려 있으므로 제조와 패키징 사이의 인터페이스는 더 이상 안정적이지 않다. 그 결과는 두 산업 사이가 아니라 한 산업의 두 단계 사이에서 일어나는 융합이다. 후공정 기업은 전공정 역량을 획득해야 하고, 전공정 기업은 자신의 역량이 패키징으로 자연스럽게 확장됨을 발견한다. 이는 무어의 법칙 종언에 관한 문헌이 일반적 수준에서 예견하고(Arden et al., 2010; Iyer, 2016; Khan et al., 2018) 패키징 공학 문헌이 기술적으로 기술해 온 현상이다(Lau, 2021, 2022). 그러나 이를 발명의 기록 속에서 관찰하는 방법은 제시되지 않았다.</w:t>
+        <w:t xml:space="preserve">에 의존한다는 점을 인식할 때 분명해진다. Ernst(2005)는 칩 설계의 수직 전문화가 의존하는 모듈성이 복잡성이 커지면서 한계를 갖는다는 것을 보였다. Jacobides et al.(2006)은 누가 무엇을 하고 가치가 어떻게 배분되는지를 정의하는 템플릿인 산업 아키텍처가 그 자체로 경쟁의 대상이며, 단계 간 상호의존을 바꾸는 혁신은 그 재협상을 불러온다고 주장하였다. 하이브리드 본딩이 바로 그러한 혁신이다. 수율이 웨이퍼 수준 평탄화, 표면 화학, 정렬 등 전공정에 자리한 역량에 달려 있으므로 제조와 패키징 사이의 인터페이스는 더 이상 안정적이지 않다. 그 결과는 두 산업 사이가 아니라 한 산업의 두 단계 사이에서 일어나는 융합이다. 후공정 기업은 전공정 역량을 획득해야 하고, 전공정 기업은 자신의 역량이 패키징으로 자연스럽게 확장됨을 발견한다. 이는 무어의 법칙 종언에 관한 문헌이 일반적 수준에서 예견하고(Arden et al., 2010; Iyer, 2016; Khan et al., 2018) 패키징 공학 문헌이 기술적으로 기술해 온 현상이다(Lau, 2021, 2022). 그러나 이를 발명의 기록 속에서 관찰하는 방법은 거의 제시되지 않았다.</w:t>
       </w:r>
     </w:p>
     <w:p>
@@ -6414,6 +6414,14 @@
       </w:pPr>
       <w:r>
         <w:t xml:space="preserve">Kapoor, R., Adner, R., 2012. What firms make vs. what they know: How firms’ production and knowledge boundaries affect competitive advantage in the face of technological change. Organization Science 23 (5), 1227–1248.</w:t>
+      </w:r>
+    </w:p>
+    <w:p>
+      <w:pPr>
+        <w:pStyle w:val="BodyText"/>
+      </w:pPr>
+      <w:r>
+        <w:t xml:space="preserve">Karvonen, M., Kässi, T., 2012. Industry convergence analysis with patent citations in changing value systems. International Journal of Business and Systems Research 6 (2), 150–175. https://doi.org/10.1504/IJBSR.2012.046353</w:t>
       </w:r>
     </w:p>
     <w:p>

</xml_diff>